<commit_message>
docs: remove institutional cover banner from database query specification PDF
</commit_message>
<xml_diff>
--- a/docs/HOSTEL_DATABASE_SPECIFICATION.docx
+++ b/docs/HOSTEL_DATABASE_SPECIFICATION.docx
@@ -2,87 +2,6 @@
 <file path=word/document.xml><?xml version="1.0" encoding="utf-8"?>
 <w:document xmlns:wpc="http://schemas.microsoft.com/office/word/2010/wordprocessingCanvas" xmlns:mo="http://schemas.microsoft.com/office/mac/office/2008/main" xmlns:mc="http://schemas.openxmlformats.org/markup-compatibility/2006" xmlns:mv="urn:schemas-microsoft-com:mac:vml" xmlns:o="urn:schemas-microsoft-com:office:office" xmlns:r="http://schemas.openxmlformats.org/officeDocument/2006/relationships" xmlns:m="http://schemas.openxmlformats.org/officeDocument/2006/math" xmlns:v="urn:schemas-microsoft-com:vml" xmlns:wp14="http://schemas.microsoft.com/office/word/2010/wordprocessingDrawing" xmlns:wp="http://schemas.openxmlformats.org/drawingml/2006/wordprocessingDrawing" xmlns:w10="urn:schemas-microsoft-com:office:word" xmlns:w="http://schemas.openxmlformats.org/wordprocessingml/2006/main" xmlns:w14="http://schemas.microsoft.com/office/word/2010/wordml" xmlns:wpg="http://schemas.microsoft.com/office/word/2010/wordprocessingGroup" xmlns:wpi="http://schemas.microsoft.com/office/word/2010/wordprocessingInk" xmlns:wne="http://schemas.microsoft.com/office/word/2006/wordml" xmlns:wps="http://schemas.microsoft.com/office/word/2010/wordprocessingShape" mc:Ignorable="w14 wp14">
   <w:body>
-    <w:p>
-      <w:pPr>
-        <w:spacing w:before="0" w:after="40"/>
-        <w:jc w:val="center"/>
-      </w:pPr>
-      <w:r>
-        <w:rPr>
-          <w:rFonts w:ascii="Times New Roman" w:hAnsi="Times New Roman"/>
-          <w:b/>
-          <w:color w:val="1E3A8A"/>
-          <w:sz w:val="26"/>
-        </w:rPr>
-        <w:t>SYMBIOSIS INSTITUTE OF TECHNOLOGY (SIT), PUNE</w:t>
-        <w:br/>
-      </w:r>
-      <w:r>
-        <w:rPr>
-          <w:rFonts w:ascii="Times New Roman" w:hAnsi="Times New Roman"/>
-          <w:b/>
-          <w:color w:val="64748B"/>
-          <w:sz w:val="20"/>
-        </w:rPr>
-        <w:t>DEPARTMENT OF COMPUTER SCIENCE &amp; ENGINEERING</w:t>
-        <w:br/>
-      </w:r>
-    </w:p>
-    <w:p>
-      <w:pPr>
-        <w:spacing w:before="160" w:after="40"/>
-        <w:jc w:val="center"/>
-      </w:pPr>
-      <w:r>
-        <w:rPr>
-          <w:rFonts w:ascii="Times New Roman" w:hAnsi="Times New Roman"/>
-          <w:b/>
-          <w:color w:val="1E3A8A"/>
-          <w:sz w:val="32"/>
-        </w:rPr>
-        <w:t>DATABASE ARCHITECTURE, SCHEMA &amp; SQL QUERY SPECIFICATION</w:t>
-        <w:br/>
-      </w:r>
-      <w:r>
-        <w:rPr>
-          <w:rFonts w:ascii="Times New Roman" w:hAnsi="Times New Roman"/>
-          <w:b/>
-          <w:color w:val="0F172A"/>
-          <w:sz w:val="23"/>
-        </w:rPr>
-        <w:t>Intelligent Hostel Complaint Management System (HostelPulse)</w:t>
-        <w:br/>
-      </w:r>
-    </w:p>
-    <w:p>
-      <w:pPr>
-        <w:spacing w:before="40" w:after="240"/>
-        <w:jc w:val="center"/>
-      </w:pPr>
-      <w:r>
-        <w:rPr>
-          <w:rFonts w:ascii="Times New Roman" w:hAnsi="Times New Roman"/>
-          <w:i/>
-          <w:color w:val="64748B"/>
-          <w:sz w:val="18"/>
-        </w:rPr>
-        <w:t>Candidate: Pranil Shah (PRN: 22070123086)  |  RDBMS Engine: SQLite 3.x / PostgreSQL 15+  |  Academic Year: 2026</w:t>
-      </w:r>
-    </w:p>
-    <w:p>
-      <w:pPr>
-        <w:spacing w:before="0" w:after="160"/>
-        <w:jc w:val="center"/>
-      </w:pPr>
-      <w:r>
-        <w:rPr>
-          <w:rFonts w:ascii="Courier New" w:hAnsi="Courier New"/>
-          <w:color w:val="CBD5E1"/>
-          <w:sz w:val="20"/>
-        </w:rPr>
-        <w:t>━━━━━━━━━━━━━━━━━━━━━━━━━━━━━━━━━━━━━━━━━━━━━━━━━━━━━━━━━━</w:t>
-      </w:r>
-    </w:p>
     <w:p>
       <w:pPr>
         <w:keepNext/>
@@ -8527,7 +8446,7 @@
                 <w:color w:val="1E3A8A"/>
                 <w:sz w:val="19"/>
               </w:rPr>
-              <w:t>SQL :: DML-03: Seed Verified Student Residents (SIT Pune)</w:t>
+              <w:t>SQL :: DML-03: Seed Verified Student Residents</w:t>
               <w:br/>
             </w:r>
             <w:r>
@@ -8536,7 +8455,7 @@
                 <w:color w:val="0F172A"/>
                 <w:sz w:val="17"/>
               </w:rPr>
-              <w:t>-- 1. Pranil Shah (PRN: 22070123086 / USN: 26070126505)</w:t>
+              <w:t>-- 1. Pranil Shah (USN: 26070126505)</w:t>
               <w:br/>
               <w:t>INSERT INTO users (full_name, email, phone, password, type) VALUES</w:t>
               <w:br/>

</xml_diff>